<commit_message>
docs: soften TJB proposal tone — explicit NO co-authorship claim
Reframed per user concern that 'collaboration/solve together' could read as a
co-authorship claim and scare Dr. Buckholtz off. Changes:
- Subtitle + cover note open with explicit 'НЕ претендую на соавторство';
  material is his to use or not. Positions Sergey as independent helper.
- 'Зачем' framing: combine 3 resources (AI tools + Sergey's computation + TJB's
  physics experience) toward a reference-grade preprint -- contribution, not credit.
- Open questions: 'if you suggest a direction, I verify it numerically' (his
  experience sets the hypothesis, verification is instant).
- Verified block -> 'what can be INCLUDED'; NEW result (W-anomaly discriminant)
  bolded; split-recommendation softened to 'optional, your call'.

Co-Authored-By: Claude Opus 4.8 <noreply@anthropic.com>
</commit_message>
<xml_diff>
--- a/paper/revision_proposal_for_TJB_RU.docx
+++ b/paper/revision_proposal_for_TJB_RU.docx
@@ -22,7 +22,9 @@
         <w:rPr>
           <w:i/>
         </w:rPr>
-        <w:t>Для д-ра Томаса Дж. Бакхольца · препринт v6 (preprints202511.0598.v6)</w:t>
+        <w:t>Независимая проверка чисел и материалы в помощь — для д-ра Томаса Дж. Бакхольца</w:t>
+        <w:br/>
+        <w:t>(препринт v6, preprints202511.0598.v6). БЕЗ претензии на соавторство.</w:t>
       </w:r>
     </w:p>
     <w:p>
@@ -42,27 +44,37 @@
     </w:p>
     <w:p>
       <w:r>
-        <w:t>Я взял на себя инициативу: изучил, как структурированы сопоставимые препринты по физике элементарных частиц, независимо перепроверил числовые соотношения вашего препринта v6 (каждое число воспроизводится запускаемым скриптом) и подготовил предложение по доработке.</w:t>
+        <w:t>Сразу самое важное: я НЕ претендую на соавторство и ни на какую долю авторства — ни в коем случае. Всё, что ниже, я делаю как ваш независимый помощник, и весь материал принадлежит вам: используйте его в вашем препринте так, как сочтёте нужным, или не используйте вовсе.</w:t>
       </w:r>
     </w:p>
     <w:p>
       <w:r>
-        <w:t>Это ЧЕРНОВИК для совместной работы, а не готовый вердикт — вы можете править его прямо в этом файле.</w:t>
+        <w:t>Что я сделал. Я независимо перепроверил числовые соотношения вашего препринта v6 — каждое число воспроизводится запускаемым скриптом, то есть его может проверить любой рецензент или коллега. По ходу проверки получилось и кое-что новое (раздел 3) — предлагаю это просто как материал, который, если сочтёте полезным, можно включить в препринт.</w:t>
       </w:r>
     </w:p>
     <w:p>
       <w:r>
-        <w:t>Что внутри: (1) сравнительная таблица «было → предлагаем → почему», где «почему» опирается на то, за что рецензенты обычно заворачивают работу; (2) открытые вопросы, отмеченные явно, чтобы решить их вместе; (3) краткий список того, что я уже проверил и на чём предложение стоит.</w:t>
+        <w:t>Зачем. Цель простая: объединить три ресурса — современные AI-инструменты, мою вычислительную работу с ними и ваш многолетний опыт в физике — чтобы довести материал до максимально строгого, «эталонного» вида, уверенно проходящего рецензию.</w:t>
       </w:r>
     </w:p>
     <w:p>
       <w:r>
-        <w:t>Ключевая рекомендация: разделить материал на (А) короткую строгую заметку о проверенных массовых соотношениях — она ничего не оверклеймит и имеет реальный шанс пройти рецензию; и (Б) программную статью о космологии MULTING, где открытые вопросы честно обозначены как направление работы.</w:t>
+        <w:t>Как устроено ниже. (1) Сравнительная таблица «было → предлагаю → почему», где «почему» опирается на то, за что рецензенты обычно заворачивают работу. (2) Открытые вопросы — отмечены честно; по любому из них, если вы подскажете направление или вариант, я готов быстро проверить его численно. (3) Что уже перепроверено и что можно включить в препринт.</w:t>
       </w:r>
     </w:p>
     <w:p>
       <w:r>
-        <w:t>С уважением,</w:t>
+        <w:t>Необязательная идея на ваше усмотрение: можно разделить материал на короткую строгую заметку о проверенных массовых соотношениях (ничего не оверклеймит, реальный шанс рецензии) и отдельную программную статью о космологии MULTING. Но это полностью ваше решение.</w:t>
+      </w:r>
+    </w:p>
+    <w:p>
+      <w:r>
+        <w:t>Это черновик для вашей правки — правьте прямо в файле.</w:t>
+      </w:r>
+    </w:p>
+    <w:p>
+      <w:r>
+        <w:t>С уважением и благодарностью за вашу работу,</w:t>
         <w:br/>
         <w:t>Сергей Бойко · Ronin Institute</w:t>
       </w:r>
@@ -339,12 +351,12 @@
           <w:color w:val="1F4E79"/>
           <w:sz w:val="28"/>
         </w:rPr>
-        <w:t>2. Открытые вопросы — решаем вместе</w:t>
+        <w:t>2. Открытые вопросы</w:t>
       </w:r>
     </w:p>
     <w:p>
       <w:r>
-        <w:t>Это не замалчивается, а выносится явно. По уровню серьёзности для рецензента (🔴 CRITICAL — без ответа возможен отказ):</w:t>
+        <w:t>Это не замалчивается, а выносится явно — рецензент всё равно их задаст, и честное признание сильнее умолчания. По уровню серьёзности (🔴 CRITICAL — без ответа возможен отказ). По любому из них: если вы подскажете физическое направление или конкретный вариант, я готов быстро проверить его численно (AI-инструменты + вычисления) — чтобы ваш опыт задавал гипотезу, а проверка была мгновенной.</w:t>
       </w:r>
     </w:p>
     <w:p>
@@ -393,7 +405,12 @@
           <w:color w:val="1F4E79"/>
           <w:sz w:val="28"/>
         </w:rPr>
-        <w:t>3. Что уже проверено (на чём стоит предложение)</w:t>
+        <w:t>3. Что уже перепроверено — и что можно включить в препринт</w:t>
+      </w:r>
+    </w:p>
+    <w:p>
+      <w:r>
+        <w:t>Всё ниже — воспроизводимо (запускаемый скрипт на каждое число) и предлагается вам как готовый материал. Жирным — что нового получилось по ходу проверки.</w:t>
       </w:r>
     </w:p>
     <w:p>
@@ -409,7 +426,13 @@
         <w:pStyle w:val="ListBullet"/>
       </w:pPr>
       <w:r>
-        <w:t>7:9:17 (m_W²:m_Z²:m_H²): держится &lt;0.05%; в scale-free форме m_W/m_H=√(7/17) не зависит от якоря; предсказывает тяжёлый W (совместимо только с CDF-II/CMS, χ²=2.0; исключает лёгкий, χ²=39) — фальсифицируемый дискриминатор W-аномалии. Скрипт: c6_mass_preference.py.</w:t>
+        <w:rPr>
+          <w:b/>
+        </w:rPr>
+        <w:t xml:space="preserve">НОВОЕ — </w:t>
+      </w:r>
+      <w:r>
+        <w:t>соотношение 7:9:17 (m_W²:m_Z²:m_H²) в scale-free форме m_W/m_H=√(7/17) не зависит от якоря (держится &lt;0.05%) и предсказывает тяжёлый W: совместимо только с CDF-II/CMS (χ²=2.0), исключает лёгкий набор (χ²=39). Это фальсифицируемый дискриминатор W-mass аномалии — конкретное предсказание, которое будущие измерения W подтвердят или отбросят. Скрипт: c6_mass_preference.py.</w:t>
       </w:r>
     </w:p>
     <w:p>
@@ -425,7 +448,13 @@
         <w:pStyle w:val="ListBullet"/>
       </w:pPr>
       <w:r>
-        <w:t>N_opt = ω_cdm/ω_b = 5.366: отклонение от целого 5 равно 5.67σ (исправлена ошибка в формуле погрешности: было ~259σ из-за несоответствия единиц).</w:t>
+        <w:rPr>
+          <w:b/>
+        </w:rPr>
+        <w:t xml:space="preserve">поправка — </w:t>
+      </w:r>
+      <w:r>
+        <w:t>N_opt = ω_cdm/ω_b = 5.366: отклонение от целого 5 равно 5.67σ (в исходном расчёте формула погрешности давала ~259σ из-за несоответствия единиц; исправлено).</w:t>
       </w:r>
     </w:p>
     <w:p/>

</xml_diff>